<commit_message>
Aclarado que el cable amarillo del divisor se corta, con el dibujo cable a cable
</commit_message>
<xml_diff>
--- a/docs/26_PASO_A_PASO_DEL_PH_VERSION_SIMPLE.docx
+++ b/docs/26_PASO_A_PASO_DEL_PH_VERSION_SIMPLE.docx
@@ -368,15 +368,30 @@
       </w:r>
     </w:p>
     <w:p>
-      <w:pPr>
-        <w:pStyle w:val="ListNumber"/>
-      </w:pPr>
       <w:r>
         <w:rPr>
           <w:b w:val="0"/>
           <w:sz w:val="22"/>
         </w:rPr>
-        <w:t>Soldá una resistencia en la punta del cable amarillo. Es igual que lo que hicimos con el AM2302.</w:t>
+        <w:t>Ojo: el cable amarillo se corta. No es como el AM2302, donde pelábamos una ventana y la</w:t>
+      </w:r>
+    </w:p>
+    <w:p>
+      <w:r>
+        <w:rPr>
+          <w:b w:val="0"/>
+          <w:sz w:val="22"/>
+        </w:rPr>
+        <w:t>resistencia quedaba al costado. Acá la primera resistencia va en el medio del camino: si le</w:t>
+      </w:r>
+    </w:p>
+    <w:p>
+      <w:r>
+        <w:rPr>
+          <w:b w:val="0"/>
+          <w:sz w:val="22"/>
+        </w:rPr>
+        <w:t>pelás una ventana y soldás ahí la pata, el cable puentea la resistencia y el divisor no hace nada.</w:t>
       </w:r>
     </w:p>
     <w:p>
@@ -388,7 +403,7 @@
           <w:b w:val="0"/>
           <w:sz w:val="22"/>
         </w:rPr>
-        <w:t>De la otra pata de esa resistencia sale el punto medio. Ahí vas a soldar dos cosas: la</w:t>
+        <w:t>Cortá el cable amarillo a unos 10 cm del conector. Quedan dos pedazos: el que viene de la</w:t>
       </w:r>
     </w:p>
     <w:p>
@@ -397,7 +412,7 @@
           <w:b w:val="0"/>
           <w:sz w:val="22"/>
         </w:rPr>
-        <w:t>segunda resistencia y el cable nuevo que va al ESP32.</w:t>
+        <w:t>placa del pH y el que sigue hacia el ESP32.</w:t>
       </w:r>
     </w:p>
     <w:p>
@@ -409,7 +424,58 @@
           <w:b w:val="0"/>
           <w:sz w:val="22"/>
         </w:rPr>
-        <w:t>La segunda resistencia va del punto medio al cable negro (que es la masa).</w:t>
+        <w:t>Soldá una resistencia entre los dos pedazos: una pata a cada lado. Es la misma soldadura que</w:t>
+      </w:r>
+    </w:p>
+    <w:p>
+      <w:r>
+        <w:rPr>
+          <w:b w:val="0"/>
+          <w:sz w:val="22"/>
+        </w:rPr>
+        <w:t>hiciste en el AM2302, solo que ahora el cable va cortado.</w:t>
+      </w:r>
+    </w:p>
+    <w:p>
+      <w:pPr>
+        <w:pStyle w:val="ListNumber"/>
+      </w:pPr>
+      <w:r>
+        <w:rPr>
+          <w:b w:val="0"/>
+          <w:sz w:val="22"/>
+        </w:rPr>
+        <w:t>La pata de la derecha de esa resistencia es el punto medio. Ahí vas a soldar dos cosas más:</w:t>
+      </w:r>
+    </w:p>
+    <w:p>
+      <w:r>
+        <w:rPr>
+          <w:b w:val="0"/>
+          <w:sz w:val="22"/>
+        </w:rPr>
+        <w:t>la segunda resistencia y el cable nuevo que va al ESP32.</w:t>
+      </w:r>
+    </w:p>
+    <w:p>
+      <w:pPr>
+        <w:pStyle w:val="ListNumber"/>
+      </w:pPr>
+      <w:r>
+        <w:rPr>
+          <w:b w:val="0"/>
+          <w:sz w:val="22"/>
+        </w:rPr>
+        <w:t>La segunda resistencia va del punto medio al cable negro. Al negro no se le corta nada: se</w:t>
+      </w:r>
+    </w:p>
+    <w:p>
+      <w:r>
+        <w:rPr>
+          <w:b w:val="0"/>
+          <w:sz w:val="22"/>
+        </w:rPr>
+        <w:t>le pela una ventana de 3 mm y ahí se suelda la pata.</w:t>
       </w:r>
     </w:p>
     <w:p>
@@ -428,6 +494,15 @@
           <w:sz w:val="22"/>
         </w:rPr>
         <w:t>y el cable que va al ESP32.</w:t>
+      </w:r>
+    </w:p>
+    <w:p>
+      <w:r>
+        <w:rPr>
+          <w:b w:val="0"/>
+          <w:sz w:val="22"/>
+        </w:rPr>
+        <w:t>El dibujo de estos tres pasos está en Figuras/25-divisor-cable-a-cable.png.</w:t>
       </w:r>
     </w:p>
     <w:p>

</xml_diff>